<commit_message>
docs: respin all styled books for default h1 page breaks
Rebuilds every book whose styles YAML had no page_break_before key
(RTL library, RLB MAS set, rapids/stream/pumice/scoria HAS+MAS,
asic-trials set, Genesys2 and NexysA7 system docs and reports,
fpga-systems MAS) so each picks up the new default h1 page breaks.
Each book respun at its latest tracked rev. The monitor book index
regeneration also picks up axis_monitor_lite and
monitor_characterization.
</commit_message>
<xml_diff>
--- a/projects/asic-trials/timing_characterization/docs/Pre_Synth_Timing_Prediction_FPGA_v0.3.docx
+++ b/projects/asic-trials/timing_characterization/docs/Pre_Synth_Timing_Prediction_FPGA_v0.3.docx
@@ -160,7 +160,7 @@
             </w:rPr>
             <w:fldChar w:fldCharType="separate"/>
           </w:r>
-          <w:hyperlink w:anchor="__RefHeading___Toc1790_3766480506">
+          <w:hyperlink w:anchor="__RefHeading___Toc1946_2181334207">
             <w:r>
               <w:rPr>
                 <w:webHidden/>
@@ -181,7 +181,7 @@
             </w:tabs>
             <w:rPr/>
           </w:pPr>
-          <w:hyperlink w:anchor="__RefHeading___Toc1792_3766480506">
+          <w:hyperlink w:anchor="__RefHeading___Toc1948_2181334207">
             <w:r>
               <w:rPr>
                 <w:webHidden/>
@@ -189,7 +189,7 @@
               </w:rPr>
               <w:t>2 Pre-Bitstream Timing Prediction on FPGA (Artix-7)</w:t>
               <w:tab/>
-              <w:t>5</w:t>
+              <w:t>6</w:t>
             </w:r>
           </w:hyperlink>
         </w:p>
@@ -202,7 +202,7 @@
             </w:tabs>
             <w:rPr/>
           </w:pPr>
-          <w:hyperlink w:anchor="__RefHeading___Toc1794_3766480506">
+          <w:hyperlink w:anchor="__RefHeading___Toc1950_2181334207">
             <w:r>
               <w:rPr>
                 <w:webHidden/>
@@ -210,7 +210,7 @@
               </w:rPr>
               <w:t>2.1 Abstract</w:t>
               <w:tab/>
-              <w:t>5</w:t>
+              <w:t>6</w:t>
             </w:r>
           </w:hyperlink>
         </w:p>
@@ -223,7 +223,7 @@
             </w:tabs>
             <w:rPr/>
           </w:pPr>
-          <w:hyperlink w:anchor="__RefHeading___Toc1796_3766480506">
+          <w:hyperlink w:anchor="__RefHeading___Toc1952_2181334207">
             <w:r>
               <w:rPr>
                 <w:webHidden/>
@@ -231,7 +231,7 @@
               </w:rPr>
               <w:t>2.2 1. What changes between the ASIC paper and this one</w:t>
               <w:tab/>
-              <w:t>6</w:t>
+              <w:t>7</w:t>
             </w:r>
           </w:hyperlink>
         </w:p>
@@ -244,7 +244,7 @@
             </w:tabs>
             <w:rPr/>
           </w:pPr>
-          <w:hyperlink w:anchor="__RefHeading___Toc1798_3766480506">
+          <w:hyperlink w:anchor="__RefHeading___Toc1954_2181334207">
             <w:r>
               <w:rPr>
                 <w:webHidden/>
@@ -252,7 +252,7 @@
               </w:rPr>
               <w:t>2.3 2. The harness on FPGA</w:t>
               <w:tab/>
-              <w:t>7</w:t>
+              <w:t>8</w:t>
             </w:r>
           </w:hyperlink>
         </w:p>
@@ -265,7 +265,7 @@
             </w:tabs>
             <w:rPr/>
           </w:pPr>
-          <w:hyperlink w:anchor="__RefHeading___Toc1800_3766480506">
+          <w:hyperlink w:anchor="__RefHeading___Toc1956_2181334207">
             <w:r>
               <w:rPr>
                 <w:webHidden/>
@@ -273,7 +273,7 @@
               </w:rPr>
               <w:t>2.4 3. The Vivado flow</w:t>
               <w:tab/>
-              <w:t>7</w:t>
+              <w:t>8</w:t>
             </w:r>
           </w:hyperlink>
         </w:p>
@@ -286,7 +286,7 @@
             </w:tabs>
             <w:rPr/>
           </w:pPr>
-          <w:hyperlink w:anchor="__RefHeading___Toc1802_3766480506">
+          <w:hyperlink w:anchor="__RefHeading___Toc1958_2181334207">
             <w:r>
               <w:rPr>
                 <w:webHidden/>
@@ -294,7 +294,7 @@
               </w:rPr>
               <w:t>2.5 4. The spreadsheet</w:t>
               <w:tab/>
-              <w:t>8</w:t>
+              <w:t>9</w:t>
             </w:r>
           </w:hyperlink>
         </w:p>
@@ -307,7 +307,7 @@
             </w:tabs>
             <w:rPr/>
           </w:pPr>
-          <w:hyperlink w:anchor="__RefHeading___Toc1804_3766480506">
+          <w:hyperlink w:anchor="__RefHeading___Toc1960_2181334207">
             <w:r>
               <w:rPr>
                 <w:webHidden/>
@@ -315,7 +315,7 @@
               </w:rPr>
               <w:t>2.5.1 4.1 characterization</w:t>
               <w:tab/>
-              <w:t>8</w:t>
+              <w:t>9</w:t>
             </w:r>
           </w:hyperlink>
         </w:p>
@@ -328,7 +328,7 @@
             </w:tabs>
             <w:rPr/>
           </w:pPr>
-          <w:hyperlink w:anchor="__RefHeading___Toc1806_3766480506">
+          <w:hyperlink w:anchor="__RefHeading___Toc1962_2181334207">
             <w:r>
               <w:rPr>
                 <w:webHidden/>
@@ -336,7 +336,7 @@
               </w:rPr>
               <w:t>2.5.2 4.2 building blocks</w:t>
               <w:tab/>
-              <w:t>9</w:t>
+              <w:t>10</w:t>
             </w:r>
           </w:hyperlink>
         </w:p>
@@ -349,7 +349,7 @@
             </w:tabs>
             <w:rPr/>
           </w:pPr>
-          <w:hyperlink w:anchor="__RefHeading___Toc1808_3766480506">
+          <w:hyperlink w:anchor="__RefHeading___Toc1964_2181334207">
             <w:r>
               <w:rPr>
                 <w:webHidden/>
@@ -357,7 +357,7 @@
               </w:rPr>
               <w:t>2.6 5. The validation loop</w:t>
               <w:tab/>
-              <w:t>10</w:t>
+              <w:t>11</w:t>
             </w:r>
           </w:hyperlink>
         </w:p>
@@ -370,7 +370,7 @@
             </w:tabs>
             <w:rPr/>
           </w:pPr>
-          <w:hyperlink w:anchor="__RefHeading___Toc1810_3766480506">
+          <w:hyperlink w:anchor="__RefHeading___Toc1966_2181334207">
             <w:r>
               <w:rPr>
                 <w:webHidden/>
@@ -378,7 +378,7 @@
               </w:rPr>
               <w:t>2.6.1 5.1 Wrapper</w:t>
               <w:tab/>
-              <w:t>10</w:t>
+              <w:t>11</w:t>
             </w:r>
           </w:hyperlink>
         </w:p>
@@ -391,7 +391,7 @@
             </w:tabs>
             <w:rPr/>
           </w:pPr>
-          <w:hyperlink w:anchor="__RefHeading___Toc1812_3766480506">
+          <w:hyperlink w:anchor="__RefHeading___Toc1968_2181334207">
             <w:r>
               <w:rPr>
                 <w:webHidden/>
@@ -412,7 +412,7 @@
             </w:tabs>
             <w:rPr/>
           </w:pPr>
-          <w:hyperlink w:anchor="__RefHeading___Toc1814_3766480506">
+          <w:hyperlink w:anchor="__RefHeading___Toc1970_2181334207">
             <w:r>
               <w:rPr>
                 <w:webHidden/>
@@ -420,7 +420,7 @@
               </w:rPr>
               <w:t>2.6.3 5.3 On-board observation</w:t>
               <w:tab/>
-              <w:t>11</w:t>
+              <w:t>12</w:t>
             </w:r>
           </w:hyperlink>
         </w:p>
@@ -433,7 +433,7 @@
             </w:tabs>
             <w:rPr/>
           </w:pPr>
-          <w:hyperlink w:anchor="__RefHeading___Toc1816_3766480506">
+          <w:hyperlink w:anchor="__RefHeading___Toc1972_2181334207">
             <w:r>
               <w:rPr>
                 <w:webHidden/>
@@ -441,7 +441,7 @@
               </w:rPr>
               <w:t>2.6.4 5.4 Vivado STA contract</w:t>
               <w:tab/>
-              <w:t>11</w:t>
+              <w:t>12</w:t>
             </w:r>
           </w:hyperlink>
         </w:p>
@@ -454,7 +454,7 @@
             </w:tabs>
             <w:rPr/>
           </w:pPr>
-          <w:hyperlink w:anchor="__RefHeading___Toc1818_3766480506">
+          <w:hyperlink w:anchor="__RefHeading___Toc1974_2181334207">
             <w:r>
               <w:rPr>
                 <w:webHidden/>
@@ -462,7 +462,7 @@
               </w:rPr>
               <w:t>2.6.5 5.5 Quick command</w:t>
               <w:tab/>
-              <w:t>11</w:t>
+              <w:t>12</w:t>
             </w:r>
           </w:hyperlink>
         </w:p>
@@ -475,7 +475,7 @@
             </w:tabs>
             <w:rPr/>
           </w:pPr>
-          <w:hyperlink w:anchor="__RefHeading___Toc1820_3766480506">
+          <w:hyperlink w:anchor="__RefHeading___Toc1976_2181334207">
             <w:r>
               <w:rPr>
                 <w:webHidden/>
@@ -496,15 +496,36 @@
             </w:tabs>
             <w:rPr/>
           </w:pPr>
-          <w:hyperlink w:anchor="__RefHeading___Toc1822_3766480506">
+          <w:hyperlink w:anchor="__RefHeading___Toc1978_2181334207">
             <w:r>
               <w:rPr>
                 <w:webHidden/>
                 <w:rStyle w:val="IndexLink"/>
               </w:rPr>
-              <w:t>2.6.7 5.7 What v0.1 still doesn’t do</w:t>
+              <w:t>2.6.7 5.6a The same sweep on Quartus (Cyclone V)</w:t>
               <w:tab/>
-              <w:t>12</w:t>
+              <w:t>13</w:t>
+            </w:r>
+          </w:hyperlink>
+        </w:p>
+        <w:p>
+          <w:pPr>
+            <w:pStyle w:val="TOC3"/>
+            <w:tabs>
+              <w:tab w:val="clear" w:pos="8793"/>
+              <w:tab w:val="right" w:pos="9359" w:leader="dot"/>
+            </w:tabs>
+            <w:rPr/>
+          </w:pPr>
+          <w:hyperlink w:anchor="__RefHeading___Toc1980_2181334207">
+            <w:r>
+              <w:rPr>
+                <w:webHidden/>
+                <w:rStyle w:val="IndexLink"/>
+              </w:rPr>
+              <w:t>2.6.8 5.7 What v0.1 still doesn’t do</w:t>
+              <w:tab/>
+              <w:t>14</w:t>
             </w:r>
           </w:hyperlink>
         </w:p>
@@ -517,7 +538,7 @@
             </w:tabs>
             <w:rPr/>
           </w:pPr>
-          <w:hyperlink w:anchor="__RefHeading___Toc1824_3766480506">
+          <w:hyperlink w:anchor="__RefHeading___Toc1982_2181334207">
             <w:r>
               <w:rPr>
                 <w:webHidden/>
@@ -525,7 +546,7 @@
               </w:rPr>
               <w:t>2.7 6. Recommended workflow</w:t>
               <w:tab/>
-              <w:t>12</w:t>
+              <w:t>14</w:t>
             </w:r>
           </w:hyperlink>
         </w:p>
@@ -538,7 +559,7 @@
             </w:tabs>
             <w:rPr/>
           </w:pPr>
-          <w:hyperlink w:anchor="__RefHeading___Toc1826_3766480506">
+          <w:hyperlink w:anchor="__RefHeading___Toc1984_2181334207">
             <w:r>
               <w:rPr>
                 <w:webHidden/>
@@ -546,7 +567,7 @@
               </w:rPr>
               <w:t>2.8 7. Limitations / intentional non-features</w:t>
               <w:tab/>
-              <w:t>13</w:t>
+              <w:t>15</w:t>
             </w:r>
           </w:hyperlink>
         </w:p>
@@ -559,7 +580,7 @@
             </w:tabs>
             <w:rPr/>
           </w:pPr>
-          <w:hyperlink w:anchor="__RefHeading___Toc1828_3766480506">
+          <w:hyperlink w:anchor="__RefHeading___Toc1986_2181334207">
             <w:r>
               <w:rPr>
                 <w:webHidden/>
@@ -567,7 +588,7 @@
               </w:rPr>
               <w:t>2.9 8. Navigation</w:t>
               <w:tab/>
-              <w:t>13</w:t>
+              <w:t>15</w:t>
             </w:r>
           </w:hyperlink>
           <w:r>
@@ -682,7 +703,7 @@
         <w:spacing w:before="0" w:after="120"/>
         <w:rPr/>
       </w:pPr>
-      <w:bookmarkStart w:id="2" w:name="__RefHeading___Toc1790_3766480506"/>
+      <w:bookmarkStart w:id="2" w:name="__RefHeading___Toc1946_2181334207"/>
       <w:bookmarkEnd w:id="2"/>
       <w:r>
         <w:rPr>
@@ -720,7 +741,7 @@
         <w:rPr>
           <w:sz w:val="20"/>
         </w:rPr>
-        <w:t xml:space="preserve"> 2026-08-14</w:t>
+        <w:t xml:space="preserve"> 2026-10-02</w:t>
       </w:r>
     </w:p>
     <w:p>
@@ -809,6 +830,9 @@
         </mc:AlternateContent>
       </w:r>
       <w:bookmarkEnd w:id="3"/>
+      <w:r>
+        <w:br w:type="page"/>
+      </w:r>
     </w:p>
     <w:p>
       <w:pPr>
@@ -817,7 +841,7 @@
         <w:spacing w:before="360" w:after="120"/>
         <w:rPr/>
       </w:pPr>
-      <w:bookmarkStart w:id="4" w:name="__RefHeading___Toc1792_3766480506"/>
+      <w:bookmarkStart w:id="4" w:name="__RefHeading___Toc1948_2181334207"/>
       <w:bookmarkStart w:id="5" w:name="X4cfa260d7157bfd9c5dee588643ea9b6e76fbd2"/>
       <w:bookmarkEnd w:id="4"/>
       <w:r>
@@ -899,7 +923,7 @@
       <w:hyperlink r:id="rId3">
         <w:r>
           <w:rPr>
-            <w:rStyle w:val="ListLabel73"/>
+            <w:rStyle w:val="ListLabel82"/>
             <w:rFonts w:ascii="Consolas" w:hAnsi="Consolas"/>
             <w:sz w:val="22"/>
             <w:sz w:val="22"/>
@@ -998,7 +1022,7 @@
         <w:spacing w:before="280" w:after="80"/>
         <w:rPr/>
       </w:pPr>
-      <w:bookmarkStart w:id="6" w:name="__RefHeading___Toc1794_3766480506"/>
+      <w:bookmarkStart w:id="6" w:name="__RefHeading___Toc1950_2181334207"/>
       <w:bookmarkStart w:id="7" w:name="abstract"/>
       <w:bookmarkEnd w:id="6"/>
       <w:r>
@@ -1127,7 +1151,7 @@
       <w:hyperlink r:id="rId4">
         <w:r>
           <w:rPr>
-            <w:rStyle w:val="ListLabel73"/>
+            <w:rStyle w:val="ListLabel82"/>
             <w:rFonts w:ascii="Consolas" w:hAnsi="Consolas"/>
             <w:sz w:val="22"/>
             <w:sz w:val="22"/>
@@ -1144,7 +1168,7 @@
       <w:hyperlink r:id="rId5">
         <w:r>
           <w:rPr>
-            <w:rStyle w:val="ListLabel73"/>
+            <w:rStyle w:val="ListLabel82"/>
             <w:rFonts w:ascii="Consolas" w:hAnsi="Consolas"/>
             <w:sz w:val="22"/>
             <w:sz w:val="22"/>
@@ -1161,7 +1185,7 @@
       <w:hyperlink r:id="rId6">
         <w:r>
           <w:rPr>
-            <w:rStyle w:val="ListLabel73"/>
+            <w:rStyle w:val="ListLabel82"/>
             <w:rFonts w:ascii="Consolas" w:hAnsi="Consolas"/>
             <w:sz w:val="22"/>
             <w:sz w:val="22"/>
@@ -1310,7 +1334,7 @@
         <w:spacing w:before="280" w:after="80"/>
         <w:rPr/>
       </w:pPr>
-      <w:bookmarkStart w:id="9" w:name="__RefHeading___Toc1796_3766480506"/>
+      <w:bookmarkStart w:id="9" w:name="__RefHeading___Toc1952_2181334207"/>
       <w:bookmarkStart w:id="10" w:name="Xb6e78256faf625b1072c6eb866dca5ac1548ce3"/>
       <w:bookmarkEnd w:id="9"/>
       <w:r>
@@ -2664,7 +2688,7 @@
         <w:spacing w:before="280" w:after="80"/>
         <w:rPr/>
       </w:pPr>
-      <w:bookmarkStart w:id="12" w:name="__RefHeading___Toc1798_3766480506"/>
+      <w:bookmarkStart w:id="12" w:name="__RefHeading___Toc1954_2181334207"/>
       <w:bookmarkStart w:id="13" w:name="the-harness-on-fpga"/>
       <w:bookmarkEnd w:id="12"/>
       <w:r>
@@ -2758,14 +2782,14 @@
         <w:pStyle w:val="Compact"/>
         <w:numPr>
           <w:ilvl w:val="0"/>
-          <w:numId w:val="9"/>
+          <w:numId w:val="10"/>
         </w:numPr>
         <w:rPr/>
       </w:pPr>
       <w:hyperlink r:id="rId8">
         <w:r>
           <w:rPr>
-            <w:rStyle w:val="ListLabel73"/>
+            <w:rStyle w:val="ListLabel82"/>
             <w:rFonts w:ascii="Consolas" w:hAnsi="Consolas"/>
             <w:sz w:val="22"/>
             <w:sz w:val="22"/>
@@ -2793,7 +2817,7 @@
         <w:pStyle w:val="Compact"/>
         <w:numPr>
           <w:ilvl w:val="0"/>
-          <w:numId w:val="10"/>
+          <w:numId w:val="11"/>
         </w:numPr>
         <w:rPr/>
       </w:pPr>
@@ -2807,7 +2831,7 @@
         <w:pStyle w:val="Compact"/>
         <w:numPr>
           <w:ilvl w:val="0"/>
-          <w:numId w:val="11"/>
+          <w:numId w:val="12"/>
         </w:numPr>
         <w:rPr/>
       </w:pPr>
@@ -2953,7 +2977,7 @@
         <w:spacing w:before="280" w:after="80"/>
         <w:rPr/>
       </w:pPr>
-      <w:bookmarkStart w:id="15" w:name="__RefHeading___Toc1800_3766480506"/>
+      <w:bookmarkStart w:id="15" w:name="__RefHeading___Toc1956_2181334207"/>
       <w:bookmarkStart w:id="16" w:name="the-vivado-flow"/>
       <w:bookmarkEnd w:id="15"/>
       <w:r>
@@ -2989,7 +3013,7 @@
       <w:hyperlink r:id="rId9">
         <w:r>
           <w:rPr>
-            <w:rStyle w:val="ListLabel73"/>
+            <w:rStyle w:val="ListLabel82"/>
             <w:rFonts w:ascii="Consolas" w:hAnsi="Consolas"/>
             <w:sz w:val="22"/>
             <w:sz w:val="22"/>
@@ -3003,22 +3027,18 @@
         </w:rPr>
         <w:t xml:space="preserve">, shaped like </w:t>
       </w:r>
-      <w:hyperlink r:id="rId10">
-        <w:r>
-          <w:rPr>
-            <w:rStyle w:val="ListLabel73"/>
-            <w:rFonts w:ascii="Consolas" w:hAnsi="Consolas"/>
-            <w:sz w:val="22"/>
-            <w:sz w:val="22"/>
-          </w:rPr>
-          <w:t>stream_characterization/flows-stream-bridge</w:t>
-        </w:r>
-      </w:hyperlink>
-      <w:r>
-        <w:rPr>
-          <w:sz w:val="20"/>
-        </w:rPr>
-        <w:t>:</w:t>
+      <w:r>
+        <w:rPr>
+          <w:rStyle w:val="VerbatimChar"/>
+          <w:sz w:val="20"/>
+        </w:rPr>
+        <w:t>stream_characterization/flows-stream-bridge</w:t>
+      </w:r>
+      <w:r>
+        <w:rPr>
+          <w:sz w:val="20"/>
+        </w:rPr>
+        <w:t xml:space="preserve"> (retired):</w:t>
       </w:r>
     </w:p>
     <w:p>
@@ -3110,48 +3130,38 @@
         <w:rPr>
           <w:rStyle w:val="VerbatimChar"/>
         </w:rPr>
-        <w:t xml:space="preserve">    ├── program_fpga.tcl          JTAG flash via Vivado hw_server</w:t>
-      </w:r>
-      <w:r>
-        <w:rPr/>
-        <w:br/>
+        <w:t xml:space="preserve">    └── (filelist expansion comes from the shared make/tcl/filelist_utils.tcl)</w:t>
+      </w:r>
+    </w:p>
+    <w:p>
+      <w:pPr>
+        <w:pStyle w:val="FirstParagraph"/>
+        <w:rPr/>
+      </w:pPr>
+      <w:r>
+        <w:rPr>
+          <w:sz w:val="20"/>
+        </w:rPr>
+        <w:t xml:space="preserve">Quick start (with </w:t>
       </w:r>
       <w:r>
         <w:rPr>
           <w:rStyle w:val="VerbatimChar"/>
-        </w:rPr>
-        <w:t xml:space="preserve">    └── filelist_utils.tcl        env-var + +incdir + nested -f support</w:t>
-      </w:r>
-    </w:p>
-    <w:p>
-      <w:pPr>
-        <w:pStyle w:val="FirstParagraph"/>
-        <w:rPr/>
-      </w:pPr>
-      <w:r>
-        <w:rPr>
-          <w:sz w:val="20"/>
-        </w:rPr>
-        <w:t xml:space="preserve">Quick start (with </w:t>
+          <w:sz w:val="20"/>
+        </w:rPr>
+        <w:t>REPO_ROOT</w:t>
+      </w:r>
+      <w:r>
+        <w:rPr>
+          <w:sz w:val="20"/>
+        </w:rPr>
+        <w:t xml:space="preserve"> exported via the repo’s </w:t>
       </w:r>
       <w:r>
         <w:rPr>
           <w:rStyle w:val="VerbatimChar"/>
           <w:sz w:val="20"/>
         </w:rPr>
-        <w:t>REPO_ROOT</w:t>
-      </w:r>
-      <w:r>
-        <w:rPr>
-          <w:sz w:val="20"/>
-        </w:rPr>
-        <w:t xml:space="preserve"> exported via the repo’s </w:t>
-      </w:r>
-      <w:r>
-        <w:rPr>
-          <w:rStyle w:val="VerbatimChar"/>
-          <w:sz w:val="20"/>
-        </w:rPr>
         <w:t>env_python</w:t>
       </w:r>
       <w:r>
@@ -3176,7 +3186,7 @@
         <w:rPr>
           <w:rStyle w:val="NormalTok"/>
         </w:rPr>
-        <w:t xml:space="preserve"> projects/NexysA7/timing_characterization/fpga</w:t>
+        <w:t xml:space="preserve"> projects/asic-trials/timing_characterization/fpga</w:t>
       </w:r>
       <w:r>
         <w:rPr/>
@@ -3855,7 +3865,7 @@
         <w:spacing w:before="280" w:after="80"/>
         <w:rPr/>
       </w:pPr>
-      <w:bookmarkStart w:id="18" w:name="__RefHeading___Toc1802_3766480506"/>
+      <w:bookmarkStart w:id="18" w:name="__RefHeading___Toc1958_2181334207"/>
       <w:bookmarkStart w:id="19" w:name="the-spreadsheet"/>
       <w:bookmarkEnd w:id="18"/>
       <w:r>
@@ -3882,10 +3892,10 @@
         <w:pStyle w:val="FirstParagraph"/>
         <w:rPr/>
       </w:pPr>
-      <w:hyperlink r:id="rId11">
+      <w:hyperlink r:id="rId10">
         <w:r>
           <w:rPr>
-            <w:rStyle w:val="ListLabel73"/>
+            <w:rStyle w:val="ListLabel82"/>
             <w:rFonts w:ascii="Consolas" w:hAnsi="Consolas"/>
             <w:sz w:val="22"/>
             <w:sz w:val="22"/>
@@ -3906,7 +3916,7 @@
         <w:spacing w:before="200" w:after="80"/>
         <w:rPr/>
       </w:pPr>
-      <w:bookmarkStart w:id="20" w:name="__RefHeading___Toc1804_3766480506"/>
+      <w:bookmarkStart w:id="20" w:name="__RefHeading___Toc1960_2181334207"/>
       <w:bookmarkStart w:id="21" w:name="characterization"/>
       <w:bookmarkEnd w:id="20"/>
       <w:r>
@@ -5649,7 +5659,7 @@
         <w:spacing w:before="200" w:after="80"/>
         <w:rPr/>
       </w:pPr>
-      <w:bookmarkStart w:id="23" w:name="__RefHeading___Toc1806_3766480506"/>
+      <w:bookmarkStart w:id="23" w:name="__RefHeading___Toc1962_2181334207"/>
       <w:bookmarkStart w:id="24" w:name="building-blocks"/>
       <w:bookmarkEnd w:id="23"/>
       <w:r>
@@ -5690,22 +5700,6 @@
           <w:sz w:val="20"/>
         </w:rPr>
         <w:t>One row per reusable RTL block, with editable params and corner-aware target columns:</w:t>
-      </w:r>
-    </w:p>
-    <w:p>
-      <w:pPr>
-        <w:pStyle w:val="Compact"/>
-        <w:numPr>
-          <w:ilvl w:val="0"/>
-          <w:numId w:val="12"/>
-        </w:numPr>
-        <w:rPr/>
-      </w:pPr>
-      <w:r>
-        <w:rPr>
-          <w:rStyle w:val="VerbatimChar"/>
-        </w:rPr>
-        <w:t>gaxi_skid_buffer</w:t>
       </w:r>
     </w:p>
     <w:p>
@@ -5721,7 +5715,7 @@
         <w:rPr>
           <w:rStyle w:val="VerbatimChar"/>
         </w:rPr>
-        <w:t>gaxi_fifo_sync (REG=0)</w:t>
+        <w:t>gaxi_skid_buffer</w:t>
       </w:r>
     </w:p>
     <w:p>
@@ -5737,7 +5731,7 @@
         <w:rPr>
           <w:rStyle w:val="VerbatimChar"/>
         </w:rPr>
-        <w:t>gaxi_fifo_sync (REG=1, BRAM-backed)</w:t>
+        <w:t>gaxi_fifo_sync (REG=0)</w:t>
       </w:r>
     </w:p>
     <w:p>
@@ -5753,7 +5747,7 @@
         <w:rPr>
           <w:rStyle w:val="VerbatimChar"/>
         </w:rPr>
-        <w:t>arbiter_round_robin</w:t>
+        <w:t>gaxi_fifo_sync (REG=1, BRAM-backed)</w:t>
       </w:r>
     </w:p>
     <w:p>
@@ -5769,7 +5763,7 @@
         <w:rPr>
           <w:rStyle w:val="VerbatimChar"/>
         </w:rPr>
-        <w:t>axi4_master_rd</w:t>
+        <w:t>arbiter_round_robin</w:t>
       </w:r>
     </w:p>
     <w:p>
@@ -5785,7 +5779,7 @@
         <w:rPr>
           <w:rStyle w:val="VerbatimChar"/>
         </w:rPr>
-        <w:t>axi4_master_wr</w:t>
+        <w:t>axi4_master_rd</w:t>
       </w:r>
     </w:p>
     <w:p>
@@ -5794,6 +5788,22 @@
         <w:numPr>
           <w:ilvl w:val="0"/>
           <w:numId w:val="18"/>
+        </w:numPr>
+        <w:rPr/>
+      </w:pPr>
+      <w:r>
+        <w:rPr>
+          <w:rStyle w:val="VerbatimChar"/>
+        </w:rPr>
+        <w:t>axi4_master_wr</w:t>
+      </w:r>
+    </w:p>
+    <w:p>
+      <w:pPr>
+        <w:pStyle w:val="Compact"/>
+        <w:numPr>
+          <w:ilvl w:val="0"/>
+          <w:numId w:val="19"/>
         </w:numPr>
         <w:rPr/>
       </w:pPr>
@@ -5930,7 +5940,7 @@
         <w:spacing w:before="280" w:after="80"/>
         <w:rPr/>
       </w:pPr>
-      <w:bookmarkStart w:id="27" w:name="__RefHeading___Toc1808_3766480506"/>
+      <w:bookmarkStart w:id="27" w:name="__RefHeading___Toc1964_2181334207"/>
       <w:bookmarkStart w:id="28" w:name="the-validation-loop"/>
       <w:bookmarkEnd w:id="27"/>
       <w:r>
@@ -6070,7 +6080,7 @@
         <w:spacing w:before="200" w:after="80"/>
         <w:rPr/>
       </w:pPr>
-      <w:bookmarkStart w:id="29" w:name="__RefHeading___Toc1810_3766480506"/>
+      <w:bookmarkStart w:id="29" w:name="__RefHeading___Toc1966_2181334207"/>
       <w:bookmarkStart w:id="30" w:name="wrapper"/>
       <w:bookmarkEnd w:id="29"/>
       <w:r>
@@ -6097,10 +6107,10 @@
         <w:pStyle w:val="FirstParagraph"/>
         <w:rPr/>
       </w:pPr>
-      <w:hyperlink r:id="rId12">
+      <w:hyperlink r:id="rId11">
         <w:r>
           <w:rPr>
-            <w:rStyle w:val="ListLabel73"/>
+            <w:rStyle w:val="ListLabel82"/>
             <w:rFonts w:ascii="Consolas" w:hAnsi="Consolas"/>
             <w:sz w:val="22"/>
             <w:sz w:val="22"/>
@@ -6691,7 +6701,7 @@
         <w:spacing w:before="200" w:after="80"/>
         <w:rPr/>
       </w:pPr>
-      <w:bookmarkStart w:id="31" w:name="__RefHeading___Toc1812_3766480506"/>
+      <w:bookmarkStart w:id="31" w:name="__RefHeading___Toc1968_2181334207"/>
       <w:bookmarkStart w:id="32" w:name="signature-accumulator"/>
       <w:bookmarkEnd w:id="31"/>
       <w:r>
@@ -6718,10 +6728,10 @@
         <w:pStyle w:val="FirstParagraph"/>
         <w:rPr/>
       </w:pPr>
-      <w:hyperlink r:id="rId13">
+      <w:hyperlink r:id="rId12">
         <w:r>
           <w:rPr>
-            <w:rStyle w:val="ListLabel73"/>
+            <w:rStyle w:val="ListLabel82"/>
             <w:rFonts w:ascii="Consolas" w:hAnsi="Consolas"/>
             <w:sz w:val="22"/>
             <w:sz w:val="22"/>
@@ -6756,7 +6766,7 @@
         <w:spacing w:before="200" w:after="80"/>
         <w:rPr/>
       </w:pPr>
-      <w:bookmarkStart w:id="33" w:name="__RefHeading___Toc1814_3766480506"/>
+      <w:bookmarkStart w:id="33" w:name="__RefHeading___Toc1970_2181334207"/>
       <w:bookmarkStart w:id="34" w:name="on-board-observation"/>
       <w:bookmarkEnd w:id="33"/>
       <w:r>
@@ -7264,7 +7274,7 @@
         <w:spacing w:before="200" w:after="80"/>
         <w:rPr/>
       </w:pPr>
-      <w:bookmarkStart w:id="36" w:name="__RefHeading___Toc1816_3766480506"/>
+      <w:bookmarkStart w:id="36" w:name="__RefHeading___Toc1972_2181334207"/>
       <w:bookmarkStart w:id="37" w:name="vivado-sta-contract"/>
       <w:bookmarkEnd w:id="36"/>
       <w:r>
@@ -7377,7 +7387,7 @@
         <w:spacing w:before="200" w:after="80"/>
         <w:rPr/>
       </w:pPr>
-      <w:bookmarkStart w:id="38" w:name="__RefHeading___Toc1818_3766480506"/>
+      <w:bookmarkStart w:id="38" w:name="__RefHeading___Toc1974_2181334207"/>
       <w:bookmarkStart w:id="39" w:name="quick-command"/>
       <w:bookmarkEnd w:id="38"/>
       <w:r>
@@ -7414,7 +7424,7 @@
         <w:rPr>
           <w:rStyle w:val="NormalTok"/>
         </w:rPr>
-        <w:t xml:space="preserve"> projects/NexysA7/timing_characterization/fpga</w:t>
+        <w:t xml:space="preserve"> projects/asic-trials/timing_characterization/fpga</w:t>
       </w:r>
       <w:r>
         <w:rPr/>
@@ -7484,7 +7494,7 @@
         <w:spacing w:before="200" w:after="80"/>
         <w:rPr/>
       </w:pPr>
-      <w:bookmarkStart w:id="40" w:name="__RefHeading___Toc1820_3766480506"/>
+      <w:bookmarkStart w:id="40" w:name="__RefHeading___Toc1976_2181334207"/>
       <w:bookmarkStart w:id="41" w:name="the-simpler-sweep-when-sta-is-enough"/>
       <w:bookmarkEnd w:id="40"/>
       <w:r>
@@ -7650,18 +7660,18 @@
           <w:rStyle w:val="VerbatimChar"/>
           <w:sz w:val="20"/>
         </w:rPr>
-        <w:t>freq_mhz, period_ns, group, wns_ns, slack_status, utilization_luts, utilization_ffs, utilization_brams, utilization_dsps</w:t>
-      </w:r>
-      <w:r>
-        <w:rPr>
-          <w:sz w:val="20"/>
-        </w:rPr>
-        <w:t xml:space="preserve">. That’s the direct input to recalibrating </w:t>
-      </w:r>
-      <w:hyperlink r:id="rId14">
+        <w:t>freq_mhz, period_ns, group, wns_ns, slack_status, utilization_luts, utilization_ffs, utilization_brams, utilization_dsps, data_delay_ns, logic_levels</w:t>
+      </w:r>
+      <w:r>
+        <w:rPr>
+          <w:sz w:val="20"/>
+        </w:rPr>
+        <w:t xml:space="preserve"> (the last two are filled by the Quartus sweep below and empty here). That’s the direct input to recalibrating </w:t>
+      </w:r>
+      <w:hyperlink r:id="rId13">
         <w:r>
           <w:rPr>
-            <w:rStyle w:val="ListLabel73"/>
+            <w:rStyle w:val="ListLabel82"/>
             <w:rFonts w:ascii="Consolas" w:hAnsi="Consolas"/>
             <w:sz w:val="22"/>
             <w:sz w:val="22"/>
@@ -7713,10 +7723,10 @@
         </w:rPr>
         <w:t xml:space="preserve"> env var that </w:t>
       </w:r>
-      <w:hyperlink r:id="rId15">
+      <w:hyperlink r:id="rId14">
         <w:r>
           <w:rPr>
-            <w:rStyle w:val="ListLabel73"/>
+            <w:rStyle w:val="ListLabel82"/>
             <w:rFonts w:ascii="Consolas" w:hAnsi="Consolas"/>
             <w:sz w:val="22"/>
             <w:sz w:val="22"/>
@@ -7738,8 +7748,8 @@
         <w:spacing w:before="200" w:after="80"/>
         <w:rPr/>
       </w:pPr>
-      <w:bookmarkStart w:id="42" w:name="__RefHeading___Toc1822_3766480506"/>
-      <w:bookmarkStart w:id="43" w:name="what-v0.1-still-doesnt-do"/>
+      <w:bookmarkStart w:id="42" w:name="__RefHeading___Toc1978_2181334207"/>
+      <w:bookmarkStart w:id="43" w:name="a-the-same-sweep-on-quartus-cyclone-v"/>
       <w:bookmarkEnd w:id="42"/>
       <w:r>
         <w:rPr>
@@ -7757,28 +7767,195 @@
           <w:sz w:val="24"/>
         </w:rPr>
         <w:tab/>
-        <w:t>5.7 What v0.1 still doesn’t do</w:t>
-      </w:r>
-    </w:p>
-    <w:p>
-      <w:pPr>
-        <w:pStyle w:val="Compact"/>
-        <w:numPr>
-          <w:ilvl w:val="0"/>
-          <w:numId w:val="19"/>
-        </w:numPr>
-        <w:rPr/>
-      </w:pPr>
-      <w:r>
-        <w:rPr>
-          <w:b/>
-          <w:bCs/>
-        </w:rPr>
-        <w:t>Host-side golden model.</w:t>
-      </w:r>
-      <w:r>
-        <w:rPr/>
-        <w:t xml:space="preserve"> Both sweeps (MMCM and target-freq) report structural / STA signals. Neither asks “did the chip produce THE RIGHT data?” A UART or USB-blaster handshake out to the host’s LFSR reference model would close that gap.</w:t>
+        <w:t>5.6a The same sweep on Quartus (Cyclone V)</w:t>
+      </w:r>
+    </w:p>
+    <w:p>
+      <w:pPr>
+        <w:pStyle w:val="FirstParagraph"/>
+        <w:rPr/>
+      </w:pPr>
+      <w:r>
+        <w:rPr>
+          <w:rStyle w:val="VerbatimChar"/>
+          <w:sz w:val="20"/>
+        </w:rPr>
+        <w:t>make quartus-sweep</w:t>
+      </w:r>
+      <w:r>
+        <w:rPr>
+          <w:sz w:val="20"/>
+        </w:rPr>
+        <w:t xml:space="preserve"> is the Quartus twin (timing_characterization TASK-001, 2026-09-29). It compiles </w:t>
+      </w:r>
+      <w:r>
+        <w:rPr>
+          <w:rStyle w:val="VerbatimChar"/>
+          <w:sz w:val="20"/>
+        </w:rPr>
+        <w:t>char_top</w:t>
+      </w:r>
+      <w:r>
+        <w:rPr>
+          <w:sz w:val="20"/>
+        </w:rPr>
+        <w:t xml:space="preserve"> itself – not a board wrapper – once per frequency on the device named in a config file, with the SAME multi-flow SDC the ASIC and Vivado flows use (</w:t>
+      </w:r>
+      <w:r>
+        <w:rPr>
+          <w:rStyle w:val="VerbatimChar"/>
+          <w:sz w:val="20"/>
+        </w:rPr>
+        <w:t>rtl/syn/char_top.sdc</w:t>
+      </w:r>
+      <w:r>
+        <w:rPr>
+          <w:sz w:val="20"/>
+        </w:rPr>
+        <w:t xml:space="preserve">, </w:t>
+      </w:r>
+      <w:r>
+        <w:rPr>
+          <w:rStyle w:val="VerbatimChar"/>
+          <w:sz w:val="20"/>
+        </w:rPr>
+        <w:t>FLOW "quartus"</w:t>
+      </w:r>
+      <w:r>
+        <w:rPr>
+          <w:sz w:val="20"/>
+        </w:rPr>
+        <w:t>), so the three flows measure one constraint:</w:t>
+      </w:r>
+    </w:p>
+    <w:p>
+      <w:pPr>
+        <w:pStyle w:val="SourceCode"/>
+        <w:rPr/>
+      </w:pPr>
+      <w:r>
+        <w:rPr>
+          <w:rStyle w:val="BuiltInTok"/>
+        </w:rPr>
+        <w:t>cd</w:t>
+      </w:r>
+      <w:r>
+        <w:rPr>
+          <w:rStyle w:val="NormalTok"/>
+        </w:rPr>
+        <w:t xml:space="preserve"> fpga</w:t>
+      </w:r>
+      <w:r>
+        <w:rPr/>
+        <w:br/>
+      </w:r>
+      <w:r>
+        <w:rPr>
+          <w:rStyle w:val="FunctionTok"/>
+        </w:rPr>
+        <w:t>make</w:t>
+      </w:r>
+      <w:r>
+        <w:rPr>
+          <w:rStyle w:val="NormalTok"/>
+        </w:rPr>
+        <w:t xml:space="preserve"> quartus-sweep QUARTUS_SH=~/intelFPGA_lite/24.1std/quartus/bin/quartus_sh</w:t>
+      </w:r>
+      <w:r>
+        <w:rPr/>
+        <w:br/>
+      </w:r>
+      <w:r>
+        <w:rPr>
+          <w:rStyle w:val="CommentTok"/>
+        </w:rPr>
+        <w:t>#   QUARTUS_CFG=quartus/sweep_config.example.tcl   (device, I/O split, parameters)</w:t>
+      </w:r>
+      <w:r>
+        <w:rPr/>
+        <w:br/>
+      </w:r>
+      <w:r>
+        <w:rPr>
+          <w:rStyle w:val="CommentTok"/>
+        </w:rPr>
+        <w:t>#   FREQS_MHZ="100 150 200 250 300"                (same default list as bitstream-sweep)</w:t>
+      </w:r>
+      <w:r>
+        <w:rPr/>
+        <w:br/>
+      </w:r>
+      <w:r>
+        <w:rPr>
+          <w:rStyle w:val="FunctionTok"/>
+        </w:rPr>
+        <w:t>make</w:t>
+      </w:r>
+      <w:r>
+        <w:rPr>
+          <w:rStyle w:val="NormalTok"/>
+        </w:rPr>
+        <w:t xml:space="preserve"> quartus-sweep-dry   </w:t>
+      </w:r>
+      <w:r>
+        <w:rPr>
+          <w:rStyle w:val="CommentTok"/>
+        </w:rPr>
+        <w:t># print the plan under plain tclsh, compile nothing</w:t>
+      </w:r>
+      <w:r>
+        <w:rPr/>
+        <w:br/>
+      </w:r>
+      <w:r>
+        <w:rPr>
+          <w:rStyle w:val="FunctionTok"/>
+        </w:rPr>
+        <w:t>cat</w:t>
+      </w:r>
+      <w:r>
+        <w:rPr>
+          <w:rStyle w:val="NormalTok"/>
+        </w:rPr>
+        <w:t xml:space="preserve"> reports/quartus/sweep_wns.csv</w:t>
+      </w:r>
+    </w:p>
+    <w:p>
+      <w:pPr>
+        <w:pStyle w:val="FirstParagraph"/>
+        <w:rPr/>
+      </w:pPr>
+      <w:r>
+        <w:rPr>
+          <w:sz w:val="20"/>
+        </w:rPr>
+        <w:t xml:space="preserve">Each point is a fresh project under </w:t>
+      </w:r>
+      <w:r>
+        <w:rPr>
+          <w:rStyle w:val="VerbatimChar"/>
+          <w:sz w:val="20"/>
+        </w:rPr>
+        <w:t>build/quartus/&lt;F&gt;MHz/</w:t>
+      </w:r>
+      <w:r>
+        <w:rPr>
+          <w:sz w:val="20"/>
+        </w:rPr>
+        <w:t xml:space="preserve"> (map, fit, STA; no assembler, ~90 s on a Cyclone V GX for the full char_top). Two things the Vivado sweep does not give you land in </w:t>
+      </w:r>
+      <w:r>
+        <w:rPr>
+          <w:rStyle w:val="VerbatimChar"/>
+          <w:sz w:val="20"/>
+        </w:rPr>
+        <w:t>reports/quartus/sweep_&lt;F&gt;MHz/</w:t>
+      </w:r>
+      <w:r>
+        <w:rPr>
+          <w:sz w:val="20"/>
+        </w:rPr>
+        <w:t>:</w:t>
       </w:r>
     </w:p>
     <w:p>
@@ -7792,9 +7969,332 @@
       </w:pPr>
       <w:r>
         <w:rPr>
+          <w:rStyle w:val="VerbatimChar"/>
           <w:b/>
           <w:bCs/>
         </w:rPr>
+        <w:t>fub_slack.csv</w:t>
+      </w:r>
+      <w:r>
+        <w:rPr/>
+        <w:t xml:space="preserve"> from </w:t>
+      </w:r>
+      <w:hyperlink r:id="rId15">
+        <w:r>
+          <w:rPr>
+            <w:rStyle w:val="ListLabel82"/>
+            <w:rFonts w:ascii="Consolas" w:hAnsi="Consolas"/>
+            <w:sz w:val="22"/>
+            <w:sz w:val="22"/>
+          </w:rPr>
+          <w:t>fpga/quartus/sta_reports.tcl</w:t>
+        </w:r>
+      </w:hyperlink>
+      <w:r>
+        <w:rPr/>
+        <w:t xml:space="preserve">: for every FUB the worst register-to-register setup path launched from its flops – slack, data-path delay and </w:t>
+      </w:r>
+      <w:r>
+        <w:rPr>
+          <w:b/>
+          <w:bCs/>
+        </w:rPr>
+        <w:t>logic levels</w:t>
+      </w:r>
+      <w:r>
+        <w:rPr/>
+        <w:t xml:space="preserve"> – plus a </w:t>
+      </w:r>
+      <w:r>
+        <w:rPr>
+          <w:rStyle w:val="VerbatimChar"/>
+        </w:rPr>
+        <w:t>&lt;fub&gt;.io</w:t>
+      </w:r>
+      <w:r>
+        <w:rPr/>
+        <w:t xml:space="preserve"> row for the worst path to any endpoint (the 20 % output-delay budget lands on those) and a </w:t>
+      </w:r>
+      <w:r>
+        <w:rPr>
+          <w:rStyle w:val="VerbatimChar"/>
+        </w:rPr>
+        <w:t>design</w:t>
+      </w:r>
+      <w:r>
+        <w:rPr/>
+        <w:t xml:space="preserve"> row. This is the per-FUB gate-delay signal the methodology is after, read straight from the Timing Analyzer’s </w:t>
+      </w:r>
+      <w:r>
+        <w:rPr>
+          <w:rStyle w:val="VerbatimChar"/>
+        </w:rPr>
+        <w:t>get_timing_paths</w:t>
+      </w:r>
+      <w:r>
+        <w:rPr/>
+        <w:t xml:space="preserve"> rather than eyeballed from a report.</w:t>
+      </w:r>
+    </w:p>
+    <w:p>
+      <w:pPr>
+        <w:pStyle w:val="Compact"/>
+        <w:numPr>
+          <w:ilvl w:val="0"/>
+          <w:numId w:val="21"/>
+        </w:numPr>
+        <w:rPr/>
+      </w:pPr>
+      <w:r>
+        <w:rPr>
+          <w:b/>
+          <w:bCs/>
+        </w:rPr>
+        <w:t>All four timing models</w:t>
+      </w:r>
+      <w:r>
+        <w:rPr/>
+        <w:t xml:space="preserve"> (slow/fast x 85C/0C) as </w:t>
+      </w:r>
+      <w:r>
+        <w:rPr>
+          <w:rStyle w:val="VerbatimChar"/>
+        </w:rPr>
+        <w:t>clk:&lt;model&gt;</w:t>
+      </w:r>
+      <w:r>
+        <w:rPr/>
+        <w:t xml:space="preserve"> rows.</w:t>
+      </w:r>
+    </w:p>
+    <w:p>
+      <w:pPr>
+        <w:pStyle w:val="FirstParagraph"/>
+        <w:rPr/>
+      </w:pPr>
+      <w:r>
+        <w:rPr>
+          <w:rStyle w:val="VerbatimChar"/>
+          <w:sz w:val="20"/>
+        </w:rPr>
+        <w:t>parse_timing_sweep.py --tool quartus</w:t>
+      </w:r>
+      <w:r>
+        <w:rPr>
+          <w:sz w:val="20"/>
+        </w:rPr>
+        <w:t xml:space="preserve"> rolls both into the same CSV shape as the Vivado sweep, with two extra columns: </w:t>
+      </w:r>
+      <w:r>
+        <w:rPr>
+          <w:rStyle w:val="VerbatimChar"/>
+          <w:sz w:val="20"/>
+        </w:rPr>
+        <w:t>data_delay_ns, logic_levels</w:t>
+      </w:r>
+      <w:r>
+        <w:rPr>
+          <w:sz w:val="20"/>
+        </w:rPr>
+        <w:t xml:space="preserve"> (empty on Vivado rows). </w:t>
+      </w:r>
+      <w:r>
+        <w:rPr>
+          <w:rStyle w:val="VerbatimChar"/>
+          <w:sz w:val="20"/>
+        </w:rPr>
+        <w:t>utilization_luts</w:t>
+      </w:r>
+      <w:r>
+        <w:rPr>
+          <w:sz w:val="20"/>
+        </w:rPr>
+        <w:t xml:space="preserve"> carries ALMs on Quartus rows – an ALM is not a LUT; compare across tools by ratio, not by count.</w:t>
+      </w:r>
+    </w:p>
+    <w:p>
+      <w:pPr>
+        <w:pStyle w:val="BodyText"/>
+        <w:rPr/>
+      </w:pPr>
+      <w:r>
+        <w:rPr>
+          <w:sz w:val="20"/>
+        </w:rPr>
+        <w:t xml:space="preserve">Config is a plain Tcl file of </w:t>
+      </w:r>
+      <w:r>
+        <w:rPr>
+          <w:rStyle w:val="VerbatimChar"/>
+          <w:sz w:val="20"/>
+        </w:rPr>
+        <w:t>set</w:t>
+      </w:r>
+      <w:r>
+        <w:rPr>
+          <w:sz w:val="20"/>
+        </w:rPr>
+        <w:t xml:space="preserve"> statements (</w:t>
+      </w:r>
+      <w:hyperlink r:id="rId16">
+        <w:r>
+          <w:rPr>
+            <w:rStyle w:val="ListLabel82"/>
+            <w:rFonts w:ascii="Consolas" w:hAnsi="Consolas"/>
+            <w:sz w:val="22"/>
+            <w:sz w:val="22"/>
+          </w:rPr>
+          <w:t>fpga/quartus/sweep_config.example.tcl</w:t>
+        </w:r>
+      </w:hyperlink>
+      <w:r>
+        <w:rPr>
+          <w:sz w:val="20"/>
+        </w:rPr>
+        <w:t xml:space="preserve"> documents every key). The default device is the Cyclone V GX Starter Kit part, 5CGXFC5C6F27C7: the DE1-SoC’s 5CSEMA5F31C6 does not have 242 user pins free for the fully-enabled char_top; set </w:t>
+      </w:r>
+      <w:r>
+        <w:rPr>
+          <w:rStyle w:val="VerbatimChar"/>
+          <w:sz w:val="20"/>
+        </w:rPr>
+        <w:t>VIRTUAL_PINS 1</w:t>
+      </w:r>
+      <w:r>
+        <w:rPr>
+          <w:sz w:val="20"/>
+        </w:rPr>
+        <w:t xml:space="preserve"> to use it. Quartus Prime Lite 24.1std installs only Cyclone V and MAX 10.</w:t>
+      </w:r>
+    </w:p>
+    <w:p>
+      <w:pPr>
+        <w:pStyle w:val="BodyText"/>
+        <w:rPr/>
+      </w:pPr>
+      <w:r>
+        <w:rPr>
+          <w:sz w:val="20"/>
+        </w:rPr>
+        <w:t xml:space="preserve">Two things the first Quartus run taught, both now in the SDC: the Timing Analyzer does not implement </w:t>
+      </w:r>
+      <w:r>
+        <w:rPr>
+          <w:rStyle w:val="VerbatimChar"/>
+          <w:sz w:val="20"/>
+        </w:rPr>
+        <w:t>set_load</w:t>
+      </w:r>
+      <w:r>
+        <w:rPr>
+          <w:sz w:val="20"/>
+        </w:rPr>
+        <w:t xml:space="preserve">, and its </w:t>
+      </w:r>
+      <w:r>
+        <w:rPr>
+          <w:rStyle w:val="VerbatimChar"/>
+          <w:sz w:val="20"/>
+        </w:rPr>
+        <w:t>set_clock_uncertainty</w:t>
+      </w:r>
+      <w:r>
+        <w:rPr>
+          <w:sz w:val="20"/>
+        </w:rPr>
+        <w:t xml:space="preserve"> names the clock with </w:t>
+      </w:r>
+      <w:r>
+        <w:rPr>
+          <w:rStyle w:val="VerbatimChar"/>
+          <w:sz w:val="20"/>
+        </w:rPr>
+        <w:t>-to</w:t>
+      </w:r>
+      <w:r>
+        <w:rPr>
+          <w:sz w:val="20"/>
+        </w:rPr>
+        <w:t xml:space="preserve"> and takes the value last – </w:t>
+      </w:r>
+      <w:r>
+        <w:rPr>
+          <w:rStyle w:val="VerbatimChar"/>
+          <w:sz w:val="20"/>
+        </w:rPr>
+        <w:t>read_sdc</w:t>
+      </w:r>
+      <w:r>
+        <w:rPr>
+          <w:sz w:val="20"/>
+        </w:rPr>
+        <w:t xml:space="preserve"> aborts on the first error and the fitter then reports “Can’t fit design”, which is the SDC failure wearing a resource costume.</w:t>
+      </w:r>
+      <w:bookmarkEnd w:id="43"/>
+    </w:p>
+    <w:p>
+      <w:pPr>
+        <w:pStyle w:val="Heading3"/>
+        <w:spacing w:before="200" w:after="80"/>
+        <w:rPr/>
+      </w:pPr>
+      <w:bookmarkStart w:id="44" w:name="__RefHeading___Toc1980_2181334207"/>
+      <w:bookmarkStart w:id="45" w:name="what-v0.1-still-doesnt-do"/>
+      <w:bookmarkEnd w:id="44"/>
+      <w:r>
+        <w:rPr>
+          <w:rStyle w:val="SectionNumber"/>
+          <w:b/>
+          <w:color w:val="404040"/>
+          <w:sz w:val="24"/>
+        </w:rPr>
+        <w:t>2.6.8</w:t>
+      </w:r>
+      <w:r>
+        <w:rPr>
+          <w:b/>
+          <w:color w:val="404040"/>
+          <w:sz w:val="24"/>
+        </w:rPr>
+        <w:tab/>
+        <w:t>5.7 What v0.1 still doesn’t do</w:t>
+      </w:r>
+    </w:p>
+    <w:p>
+      <w:pPr>
+        <w:pStyle w:val="Compact"/>
+        <w:numPr>
+          <w:ilvl w:val="0"/>
+          <w:numId w:val="22"/>
+        </w:numPr>
+        <w:rPr/>
+      </w:pPr>
+      <w:r>
+        <w:rPr>
+          <w:b/>
+          <w:bCs/>
+        </w:rPr>
+        <w:t>Host-side golden model.</w:t>
+      </w:r>
+      <w:r>
+        <w:rPr/>
+        <w:t xml:space="preserve"> Both sweeps (MMCM and target-freq) report structural / STA signals. Neither asks “did the chip produce THE RIGHT data?” A UART or USB-blaster handshake out to the host’s LFSR reference model would close that gap.</w:t>
+      </w:r>
+    </w:p>
+    <w:p>
+      <w:pPr>
+        <w:pStyle w:val="Compact"/>
+        <w:numPr>
+          <w:ilvl w:val="0"/>
+          <w:numId w:val="23"/>
+        </w:numPr>
+        <w:rPr/>
+      </w:pPr>
+      <w:r>
+        <w:rPr>
+          <w:b/>
+          <w:bCs/>
+        </w:rPr>
         <w:t>Spreadsheet auto-update.</w:t>
       </w:r>
       <w:r>
@@ -7837,8 +8337,8 @@
         <w:pStyle w:val="Normal"/>
         <w:rPr/>
       </w:pPr>
-      <w:bookmarkStart w:id="44" w:name="the-validation-loop"/>
-      <w:bookmarkStart w:id="45" w:name="what-v0.1-still-doesnt-do"/>
+      <w:bookmarkStart w:id="46" w:name="the-validation-loop"/>
+      <w:bookmarkStart w:id="47" w:name="what-v0.1-still-doesnt-do"/>
       <w:r>
         <w:rPr/>
         <mc:AlternateContent>
@@ -7894,8 +8394,8 @@
           </mc:Fallback>
         </mc:AlternateContent>
       </w:r>
-      <w:bookmarkEnd w:id="44"/>
-      <w:bookmarkEnd w:id="45"/>
+      <w:bookmarkEnd w:id="46"/>
+      <w:bookmarkEnd w:id="47"/>
     </w:p>
     <w:p>
       <w:pPr>
@@ -7906,9 +8406,9 @@
         <w:spacing w:before="280" w:after="80"/>
         <w:rPr/>
       </w:pPr>
-      <w:bookmarkStart w:id="46" w:name="__RefHeading___Toc1824_3766480506"/>
-      <w:bookmarkStart w:id="47" w:name="recommended-workflow"/>
-      <w:bookmarkEnd w:id="46"/>
+      <w:bookmarkStart w:id="48" w:name="__RefHeading___Toc1982_2181334207"/>
+      <w:bookmarkStart w:id="49" w:name="recommended-workflow"/>
+      <w:bookmarkEnd w:id="48"/>
       <w:r>
         <w:rPr>
           <w:rStyle w:val="SectionNumber"/>
@@ -7933,7 +8433,7 @@
         <w:pStyle w:val="Compact"/>
         <w:numPr>
           <w:ilvl w:val="0"/>
-          <w:numId w:val="21"/>
+          <w:numId w:val="24"/>
         </w:numPr>
         <w:rPr/>
       </w:pPr>
@@ -7948,10 +8448,10 @@
         <w:rPr/>
         <w:t xml:space="preserve">. Open </w:t>
       </w:r>
-      <w:hyperlink r:id="rId16">
+      <w:hyperlink r:id="rId17">
         <w:r>
           <w:rPr>
-            <w:rStyle w:val="ListLabel73"/>
+            <w:rStyle w:val="ListLabel82"/>
             <w:rFonts w:ascii="Consolas" w:hAnsi="Consolas"/>
             <w:sz w:val="22"/>
             <w:sz w:val="22"/>
@@ -7999,7 +8499,7 @@
         <w:pStyle w:val="Compact"/>
         <w:numPr>
           <w:ilvl w:val="0"/>
-          <w:numId w:val="5"/>
+          <w:numId w:val="6"/>
         </w:numPr>
         <w:rPr/>
       </w:pPr>
@@ -8030,7 +8530,7 @@
         <w:pStyle w:val="Compact"/>
         <w:numPr>
           <w:ilvl w:val="0"/>
-          <w:numId w:val="5"/>
+          <w:numId w:val="6"/>
         </w:numPr>
         <w:rPr/>
       </w:pPr>
@@ -8071,7 +8571,7 @@
         <w:pStyle w:val="Compact"/>
         <w:numPr>
           <w:ilvl w:val="0"/>
-          <w:numId w:val="5"/>
+          <w:numId w:val="6"/>
         </w:numPr>
         <w:rPr/>
       </w:pPr>
@@ -8106,10 +8606,10 @@
         <w:rPr/>
         <w:t xml:space="preserve">. Compare the per-FUB WNS against what the spreadsheet predicted. Update </w:t>
       </w:r>
-      <w:hyperlink r:id="rId17">
+      <w:hyperlink r:id="rId18">
         <w:r>
           <w:rPr>
-            <w:rStyle w:val="ListLabel73"/>
+            <w:rStyle w:val="ListLabel82"/>
             <w:rFonts w:ascii="Consolas" w:hAnsi="Consolas"/>
             <w:sz w:val="22"/>
             <w:sz w:val="22"/>
@@ -8149,7 +8649,7 @@
         <w:pStyle w:val="Normal"/>
         <w:rPr/>
       </w:pPr>
-      <w:bookmarkStart w:id="48" w:name="recommended-workflow"/>
+      <w:bookmarkStart w:id="50" w:name="recommended-workflow"/>
       <w:r>
         <w:rPr/>
         <mc:AlternateContent>
@@ -8205,7 +8705,7 @@
           </mc:Fallback>
         </mc:AlternateContent>
       </w:r>
-      <w:bookmarkEnd w:id="48"/>
+      <w:bookmarkEnd w:id="50"/>
     </w:p>
     <w:p>
       <w:pPr>
@@ -8216,9 +8716,9 @@
         <w:spacing w:before="280" w:after="80"/>
         <w:rPr/>
       </w:pPr>
-      <w:bookmarkStart w:id="49" w:name="__RefHeading___Toc1826_3766480506"/>
-      <w:bookmarkStart w:id="50" w:name="limitations-intentional-non-features"/>
-      <w:bookmarkEnd w:id="49"/>
+      <w:bookmarkStart w:id="51" w:name="__RefHeading___Toc1984_2181334207"/>
+      <w:bookmarkStart w:id="52" w:name="limitations-intentional-non-features"/>
+      <w:bookmarkEnd w:id="51"/>
       <w:r>
         <w:rPr>
           <w:rStyle w:val="SectionNumber"/>
@@ -8236,69 +8736,6 @@
         </w:rPr>
         <w:tab/>
         <w:t>7. Limitations / intentional non-features</w:t>
-      </w:r>
-    </w:p>
-    <w:p>
-      <w:pPr>
-        <w:pStyle w:val="Compact"/>
-        <w:numPr>
-          <w:ilvl w:val="0"/>
-          <w:numId w:val="22"/>
-        </w:numPr>
-        <w:rPr/>
-      </w:pPr>
-      <w:r>
-        <w:rPr>
-          <w:b/>
-          <w:bCs/>
-        </w:rPr>
-        <w:t>Seed data are datasheet ballparks</w:t>
-      </w:r>
-      <w:r>
-        <w:rPr/>
-        <w:t>, not calibrated measurements. Treat the v0.1 workbook as a methodology demo; the per-LUT / per-CARRY4 numbers are reasonable to start a discussion but should be replaced with calibrated values from real Vivado runs.</w:t>
-      </w:r>
-    </w:p>
-    <w:p>
-      <w:pPr>
-        <w:pStyle w:val="Compact"/>
-        <w:numPr>
-          <w:ilvl w:val="0"/>
-          <w:numId w:val="23"/>
-        </w:numPr>
-        <w:rPr/>
-      </w:pPr>
-      <w:r>
-        <w:rPr>
-          <w:b/>
-          <w:bCs/>
-        </w:rPr>
-        <w:t>Wire delay is one number.</w:t>
-      </w:r>
-      <w:r>
-        <w:rPr/>
-        <w:t xml:space="preserve"> ASIC has four metal layers in the workbook; FPGA’s interconnect is more uniform and the inter-CLB routing dominates. One ps/hop with a per-clock override is enough resolution for a SWAG.</w:t>
-      </w:r>
-    </w:p>
-    <w:p>
-      <w:pPr>
-        <w:pStyle w:val="Compact"/>
-        <w:numPr>
-          <w:ilvl w:val="0"/>
-          <w:numId w:val="24"/>
-        </w:numPr>
-        <w:rPr/>
-      </w:pPr>
-      <w:r>
-        <w:rPr>
-          <w:b/>
-          <w:bCs/>
-        </w:rPr>
-        <w:t>No MMCM sweep, no host golden model.</w:t>
-      </w:r>
-      <w:r>
-        <w:rPr/>
-        <w:t xml:space="preserve"> The on-board validation loop in section 5 is sketched but not wired up.</w:t>
       </w:r>
     </w:p>
     <w:p>
@@ -8315,6 +8752,69 @@
           <w:b/>
           <w:bCs/>
         </w:rPr>
+        <w:t>Seed data are datasheet ballparks</w:t>
+      </w:r>
+      <w:r>
+        <w:rPr/>
+        <w:t>, not calibrated measurements. Treat the v0.1 workbook as a methodology demo; the per-LUT / per-CARRY4 numbers are reasonable to start a discussion but should be replaced with calibrated values from real Vivado runs.</w:t>
+      </w:r>
+    </w:p>
+    <w:p>
+      <w:pPr>
+        <w:pStyle w:val="Compact"/>
+        <w:numPr>
+          <w:ilvl w:val="0"/>
+          <w:numId w:val="26"/>
+        </w:numPr>
+        <w:rPr/>
+      </w:pPr>
+      <w:r>
+        <w:rPr>
+          <w:b/>
+          <w:bCs/>
+        </w:rPr>
+        <w:t>Wire delay is one number.</w:t>
+      </w:r>
+      <w:r>
+        <w:rPr/>
+        <w:t xml:space="preserve"> ASIC has four metal layers in the workbook; FPGA’s interconnect is more uniform and the inter-CLB routing dominates. One ps/hop with a per-clock override is enough resolution for a SWAG.</w:t>
+      </w:r>
+    </w:p>
+    <w:p>
+      <w:pPr>
+        <w:pStyle w:val="Compact"/>
+        <w:numPr>
+          <w:ilvl w:val="0"/>
+          <w:numId w:val="27"/>
+        </w:numPr>
+        <w:rPr/>
+      </w:pPr>
+      <w:r>
+        <w:rPr>
+          <w:b/>
+          <w:bCs/>
+        </w:rPr>
+        <w:t>No MMCM sweep, no host golden model.</w:t>
+      </w:r>
+      <w:r>
+        <w:rPr/>
+        <w:t xml:space="preserve"> The on-board validation loop in section 5 is sketched but not wired up.</w:t>
+      </w:r>
+    </w:p>
+    <w:p>
+      <w:pPr>
+        <w:pStyle w:val="Compact"/>
+        <w:numPr>
+          <w:ilvl w:val="0"/>
+          <w:numId w:val="28"/>
+        </w:numPr>
+        <w:rPr/>
+      </w:pPr>
+      <w:r>
+        <w:rPr>
+          <w:b/>
+          <w:bCs/>
+        </w:rPr>
         <w:t>No power numbers.</w:t>
       </w:r>
       <w:r>
@@ -8337,7 +8837,7 @@
         <w:pStyle w:val="Normal"/>
         <w:rPr/>
       </w:pPr>
-      <w:bookmarkStart w:id="51" w:name="limitations-intentional-non-features"/>
+      <w:bookmarkStart w:id="53" w:name="limitations-intentional-non-features"/>
       <w:r>
         <w:rPr/>
         <mc:AlternateContent>
@@ -8393,7 +8893,7 @@
           </mc:Fallback>
         </mc:AlternateContent>
       </w:r>
-      <w:bookmarkEnd w:id="51"/>
+      <w:bookmarkEnd w:id="53"/>
     </w:p>
     <w:p>
       <w:pPr>
@@ -8404,9 +8904,9 @@
         <w:spacing w:before="280" w:after="80"/>
         <w:rPr/>
       </w:pPr>
-      <w:bookmarkStart w:id="52" w:name="__RefHeading___Toc1828_3766480506"/>
-      <w:bookmarkStart w:id="53" w:name="navigation"/>
-      <w:bookmarkEnd w:id="52"/>
+      <w:bookmarkStart w:id="54" w:name="__RefHeading___Toc1986_2181334207"/>
+      <w:bookmarkStart w:id="55" w:name="navigation"/>
+      <w:bookmarkEnd w:id="54"/>
       <w:r>
         <w:rPr>
           <w:rStyle w:val="SectionNumber"/>
@@ -8431,7 +8931,7 @@
         <w:pStyle w:val="Compact"/>
         <w:numPr>
           <w:ilvl w:val="0"/>
-          <w:numId w:val="26"/>
+          <w:numId w:val="29"/>
         </w:numPr>
         <w:rPr/>
       </w:pPr>
@@ -8439,10 +8939,10 @@
         <w:rPr/>
         <w:t xml:space="preserve">ASIC companion paper: </w:t>
       </w:r>
-      <w:hyperlink r:id="rId18">
+      <w:hyperlink r:id="rId19">
         <w:r>
           <w:rPr>
-            <w:rStyle w:val="ListLabel73"/>
+            <w:rStyle w:val="ListLabel82"/>
             <w:rFonts w:ascii="Consolas" w:hAnsi="Consolas"/>
             <w:sz w:val="22"/>
             <w:sz w:val="22"/>
@@ -8456,7 +8956,7 @@
         <w:pStyle w:val="Compact"/>
         <w:numPr>
           <w:ilvl w:val="0"/>
-          <w:numId w:val="27"/>
+          <w:numId w:val="30"/>
         </w:numPr>
         <w:rPr/>
       </w:pPr>
@@ -8464,10 +8964,10 @@
         <w:rPr/>
         <w:t xml:space="preserve">Vivado flow Makefile: </w:t>
       </w:r>
-      <w:hyperlink r:id="rId19">
+      <w:hyperlink r:id="rId20">
         <w:r>
           <w:rPr>
-            <w:rStyle w:val="ListLabel73"/>
+            <w:rStyle w:val="ListLabel82"/>
             <w:rFonts w:ascii="Consolas" w:hAnsi="Consolas"/>
             <w:sz w:val="22"/>
             <w:sz w:val="22"/>
@@ -8481,7 +8981,7 @@
         <w:pStyle w:val="Compact"/>
         <w:numPr>
           <w:ilvl w:val="0"/>
-          <w:numId w:val="28"/>
+          <w:numId w:val="31"/>
         </w:numPr>
         <w:rPr/>
       </w:pPr>
@@ -8489,10 +8989,10 @@
         <w:rPr/>
         <w:t xml:space="preserve">Board pin map: </w:t>
       </w:r>
-      <w:hyperlink r:id="rId20">
+      <w:hyperlink r:id="rId21">
         <w:r>
           <w:rPr>
-            <w:rStyle w:val="ListLabel73"/>
+            <w:rStyle w:val="ListLabel82"/>
             <w:rFonts w:ascii="Consolas" w:hAnsi="Consolas"/>
             <w:sz w:val="22"/>
             <w:sz w:val="22"/>
@@ -8506,7 +9006,7 @@
         <w:pStyle w:val="Compact"/>
         <w:numPr>
           <w:ilvl w:val="0"/>
-          <w:numId w:val="29"/>
+          <w:numId w:val="32"/>
         </w:numPr>
         <w:rPr/>
       </w:pPr>
@@ -8514,10 +9014,10 @@
         <w:rPr/>
         <w:t xml:space="preserve">FPGA wrapper RTL: </w:t>
       </w:r>
-      <w:hyperlink r:id="rId21">
+      <w:hyperlink r:id="rId22">
         <w:r>
           <w:rPr>
-            <w:rStyle w:val="ListLabel73"/>
+            <w:rStyle w:val="ListLabel82"/>
             <w:rFonts w:ascii="Consolas" w:hAnsi="Consolas"/>
             <w:sz w:val="22"/>
             <w:sz w:val="22"/>
@@ -8531,7 +9031,7 @@
         <w:pStyle w:val="Compact"/>
         <w:numPr>
           <w:ilvl w:val="0"/>
-          <w:numId w:val="30"/>
+          <w:numId w:val="33"/>
         </w:numPr>
         <w:rPr/>
       </w:pPr>
@@ -8539,10 +9039,10 @@
         <w:rPr/>
         <w:t xml:space="preserve">FPGA spreadsheet: </w:t>
       </w:r>
-      <w:hyperlink r:id="rId22">
+      <w:hyperlink r:id="rId23">
         <w:r>
           <w:rPr>
-            <w:rStyle w:val="ListLabel73"/>
+            <w:rStyle w:val="ListLabel82"/>
             <w:rFonts w:ascii="Consolas" w:hAnsi="Consolas"/>
             <w:sz w:val="22"/>
             <w:sz w:val="22"/>
@@ -8556,7 +9056,7 @@
         <w:pStyle w:val="Compact"/>
         <w:numPr>
           <w:ilvl w:val="0"/>
-          <w:numId w:val="31"/>
+          <w:numId w:val="34"/>
         </w:numPr>
         <w:rPr/>
       </w:pPr>
@@ -8564,10 +9064,10 @@
         <w:rPr/>
         <w:t xml:space="preserve">Spreadsheet generator: </w:t>
       </w:r>
-      <w:hyperlink r:id="rId23">
+      <w:hyperlink r:id="rId24">
         <w:r>
           <w:rPr>
-            <w:rStyle w:val="ListLabel73"/>
+            <w:rStyle w:val="ListLabel82"/>
             <w:rFonts w:ascii="Consolas" w:hAnsi="Consolas"/>
             <w:sz w:val="22"/>
             <w:sz w:val="22"/>
@@ -8581,7 +9081,7 @@
         <w:pStyle w:val="Compact"/>
         <w:numPr>
           <w:ilvl w:val="0"/>
-          <w:numId w:val="32"/>
+          <w:numId w:val="35"/>
         </w:numPr>
         <w:rPr/>
       </w:pPr>
@@ -8589,10 +9089,10 @@
         <w:rPr/>
         <w:t xml:space="preserve">Components area: </w:t>
       </w:r>
-      <w:hyperlink r:id="rId24">
+      <w:hyperlink r:id="rId25">
         <w:r>
           <w:rPr>
-            <w:rStyle w:val="ListLabel73"/>
+            <w:rStyle w:val="ListLabel82"/>
             <w:rFonts w:ascii="Consolas" w:hAnsi="Consolas"/>
             <w:sz w:val="22"/>
             <w:sz w:val="22"/>
@@ -8606,7 +9106,7 @@
         <w:pStyle w:val="Compact"/>
         <w:numPr>
           <w:ilvl w:val="0"/>
-          <w:numId w:val="33"/>
+          <w:numId w:val="36"/>
         </w:numPr>
         <w:rPr/>
       </w:pPr>
@@ -8614,10 +9114,10 @@
         <w:rPr/>
         <w:t xml:space="preserve">Repository guide: </w:t>
       </w:r>
-      <w:hyperlink r:id="rId25">
+      <w:hyperlink r:id="rId26">
         <w:r>
           <w:rPr>
-            <w:rStyle w:val="ListLabel73"/>
+            <w:rStyle w:val="ListLabel82"/>
             <w:rFonts w:ascii="Consolas" w:hAnsi="Consolas"/>
             <w:sz w:val="22"/>
             <w:sz w:val="22"/>
@@ -8736,12 +9236,12 @@
         <w:t xml:space="preserve"> RTL Design Sherpa Project</w:t>
       </w:r>
       <w:bookmarkEnd w:id="5"/>
-      <w:bookmarkEnd w:id="53"/>
+      <w:bookmarkEnd w:id="55"/>
     </w:p>
     <w:sectPr>
-      <w:footerReference w:type="even" r:id="rId26"/>
-      <w:footerReference w:type="default" r:id="rId27"/>
-      <w:footerReference w:type="first" r:id="rId28"/>
+      <w:footerReference w:type="even" r:id="rId27"/>
+      <w:footerReference w:type="default" r:id="rId28"/>
+      <w:footerReference w:type="first" r:id="rId29"/>
       <w:type w:val="nextPage"/>
       <w:pgSz w:w="12240" w:h="15840"/>
       <w:pgMar w:left="1440" w:right="1440" w:gutter="0" w:header="0" w:top="1440" w:footer="720" w:bottom="1440"/>
@@ -8839,7 +9339,7 @@
               <w:rFonts w:ascii="Calibri" w:hAnsi="Calibri"/>
               <w:sz w:val="16"/>
             </w:rPr>
-            <w:t>Open Source - Apache 2.0 License</w:t>
+            <w:t>Open Source - MIT License</w:t>
           </w:r>
         </w:p>
       </w:tc>
@@ -8876,7 +9376,7 @@
           </w:r>
           <w:r>
             <w:rPr/>
-            <w:t>13</w:t>
+            <w:t>15</w:t>
           </w:r>
           <w:r>
             <w:rPr/>
@@ -8903,7 +9403,7 @@
           </w:r>
           <w:r>
             <w:rPr/>
-            <w:t>13</w:t>
+            <w:t>15</w:t>
           </w:r>
           <w:r>
             <w:rPr/>
@@ -8986,7 +9486,7 @@
               <w:rFonts w:ascii="Calibri" w:hAnsi="Calibri"/>
               <w:sz w:val="16"/>
             </w:rPr>
-            <w:t>Open Source - Apache 2.0 License</w:t>
+            <w:t>Open Source - MIT License</w:t>
           </w:r>
         </w:p>
       </w:tc>
@@ -9023,7 +9523,7 @@
           </w:r>
           <w:r>
             <w:rPr/>
-            <w:t>13</w:t>
+            <w:t>15</w:t>
           </w:r>
           <w:r>
             <w:rPr/>
@@ -9050,7 +9550,7 @@
           </w:r>
           <w:r>
             <w:rPr/>
-            <w:t>13</w:t>
+            <w:t>15</w:t>
           </w:r>
           <w:r>
             <w:rPr/>
@@ -9611,125 +10111,6 @@
   </w:abstractNum>
   <w:abstractNum w:abstractNumId="5">
     <w:lvl w:ilvl="0">
-      <w:start w:val="1"/>
-      <w:numFmt w:val="decimal"/>
-      <w:lvlText w:val="%1."/>
-      <w:lvlJc w:val="left"/>
-      <w:pPr>
-        <w:tabs>
-          <w:tab w:val="num" w:pos="0"/>
-        </w:tabs>
-        <w:ind w:left="720" w:hanging="480"/>
-      </w:pPr>
-      <w:rPr/>
-    </w:lvl>
-    <w:lvl w:ilvl="1">
-      <w:start w:val="1"/>
-      <w:numFmt w:val="decimal"/>
-      <w:lvlText w:val="%2."/>
-      <w:lvlJc w:val="left"/>
-      <w:pPr>
-        <w:tabs>
-          <w:tab w:val="num" w:pos="0"/>
-        </w:tabs>
-        <w:ind w:left="1440" w:hanging="480"/>
-      </w:pPr>
-      <w:rPr/>
-    </w:lvl>
-    <w:lvl w:ilvl="2">
-      <w:start w:val="1"/>
-      <w:numFmt w:val="decimal"/>
-      <w:lvlText w:val="%3."/>
-      <w:lvlJc w:val="left"/>
-      <w:pPr>
-        <w:tabs>
-          <w:tab w:val="num" w:pos="0"/>
-        </w:tabs>
-        <w:ind w:left="2160" w:hanging="480"/>
-      </w:pPr>
-      <w:rPr/>
-    </w:lvl>
-    <w:lvl w:ilvl="3">
-      <w:start w:val="1"/>
-      <w:numFmt w:val="decimal"/>
-      <w:lvlText w:val="%4."/>
-      <w:lvlJc w:val="left"/>
-      <w:pPr>
-        <w:tabs>
-          <w:tab w:val="num" w:pos="0"/>
-        </w:tabs>
-        <w:ind w:left="2880" w:hanging="480"/>
-      </w:pPr>
-      <w:rPr/>
-    </w:lvl>
-    <w:lvl w:ilvl="4">
-      <w:start w:val="1"/>
-      <w:numFmt w:val="decimal"/>
-      <w:lvlText w:val="%5."/>
-      <w:lvlJc w:val="left"/>
-      <w:pPr>
-        <w:tabs>
-          <w:tab w:val="num" w:pos="0"/>
-        </w:tabs>
-        <w:ind w:left="3600" w:hanging="480"/>
-      </w:pPr>
-      <w:rPr/>
-    </w:lvl>
-    <w:lvl w:ilvl="5">
-      <w:start w:val="1"/>
-      <w:numFmt w:val="decimal"/>
-      <w:lvlText w:val="%6."/>
-      <w:lvlJc w:val="left"/>
-      <w:pPr>
-        <w:tabs>
-          <w:tab w:val="num" w:pos="0"/>
-        </w:tabs>
-        <w:ind w:left="4320" w:hanging="480"/>
-      </w:pPr>
-      <w:rPr/>
-    </w:lvl>
-    <w:lvl w:ilvl="6">
-      <w:start w:val="1"/>
-      <w:numFmt w:val="decimal"/>
-      <w:lvlText w:val="%7."/>
-      <w:lvlJc w:val="left"/>
-      <w:pPr>
-        <w:tabs>
-          <w:tab w:val="num" w:pos="0"/>
-        </w:tabs>
-        <w:ind w:left="5040" w:hanging="480"/>
-      </w:pPr>
-      <w:rPr/>
-    </w:lvl>
-    <w:lvl w:ilvl="7">
-      <w:start w:val="1"/>
-      <w:numFmt w:val="decimal"/>
-      <w:lvlText w:val="%8."/>
-      <w:lvlJc w:val="left"/>
-      <w:pPr>
-        <w:tabs>
-          <w:tab w:val="num" w:pos="0"/>
-        </w:tabs>
-        <w:ind w:left="5760" w:hanging="480"/>
-      </w:pPr>
-      <w:rPr/>
-    </w:lvl>
-    <w:lvl w:ilvl="8">
-      <w:start w:val="1"/>
-      <w:numFmt w:val="decimal"/>
-      <w:lvlText w:val="%9."/>
-      <w:lvlJc w:val="left"/>
-      <w:pPr>
-        <w:tabs>
-          <w:tab w:val="num" w:pos="0"/>
-        </w:tabs>
-        <w:ind w:left="6480" w:hanging="480"/>
-      </w:pPr>
-      <w:rPr/>
-    </w:lvl>
-  </w:abstractNum>
-  <w:abstractNum w:abstractNumId="6">
-    <w:lvl w:ilvl="0">
       <w:numFmt w:val="bullet"/>
       <w:lvlText w:val=""/>
       <w:lvlJc w:val="left"/>
@@ -9864,6 +10245,125 @@
       </w:rPr>
     </w:lvl>
   </w:abstractNum>
+  <w:abstractNum w:abstractNumId="6">
+    <w:lvl w:ilvl="0">
+      <w:start w:val="1"/>
+      <w:numFmt w:val="decimal"/>
+      <w:lvlText w:val="%1."/>
+      <w:lvlJc w:val="left"/>
+      <w:pPr>
+        <w:tabs>
+          <w:tab w:val="num" w:pos="0"/>
+        </w:tabs>
+        <w:ind w:left="720" w:hanging="480"/>
+      </w:pPr>
+      <w:rPr/>
+    </w:lvl>
+    <w:lvl w:ilvl="1">
+      <w:start w:val="1"/>
+      <w:numFmt w:val="decimal"/>
+      <w:lvlText w:val="%2."/>
+      <w:lvlJc w:val="left"/>
+      <w:pPr>
+        <w:tabs>
+          <w:tab w:val="num" w:pos="0"/>
+        </w:tabs>
+        <w:ind w:left="1440" w:hanging="480"/>
+      </w:pPr>
+      <w:rPr/>
+    </w:lvl>
+    <w:lvl w:ilvl="2">
+      <w:start w:val="1"/>
+      <w:numFmt w:val="decimal"/>
+      <w:lvlText w:val="%3."/>
+      <w:lvlJc w:val="left"/>
+      <w:pPr>
+        <w:tabs>
+          <w:tab w:val="num" w:pos="0"/>
+        </w:tabs>
+        <w:ind w:left="2160" w:hanging="480"/>
+      </w:pPr>
+      <w:rPr/>
+    </w:lvl>
+    <w:lvl w:ilvl="3">
+      <w:start w:val="1"/>
+      <w:numFmt w:val="decimal"/>
+      <w:lvlText w:val="%4."/>
+      <w:lvlJc w:val="left"/>
+      <w:pPr>
+        <w:tabs>
+          <w:tab w:val="num" w:pos="0"/>
+        </w:tabs>
+        <w:ind w:left="2880" w:hanging="480"/>
+      </w:pPr>
+      <w:rPr/>
+    </w:lvl>
+    <w:lvl w:ilvl="4">
+      <w:start w:val="1"/>
+      <w:numFmt w:val="decimal"/>
+      <w:lvlText w:val="%5."/>
+      <w:lvlJc w:val="left"/>
+      <w:pPr>
+        <w:tabs>
+          <w:tab w:val="num" w:pos="0"/>
+        </w:tabs>
+        <w:ind w:left="3600" w:hanging="480"/>
+      </w:pPr>
+      <w:rPr/>
+    </w:lvl>
+    <w:lvl w:ilvl="5">
+      <w:start w:val="1"/>
+      <w:numFmt w:val="decimal"/>
+      <w:lvlText w:val="%6."/>
+      <w:lvlJc w:val="left"/>
+      <w:pPr>
+        <w:tabs>
+          <w:tab w:val="num" w:pos="0"/>
+        </w:tabs>
+        <w:ind w:left="4320" w:hanging="480"/>
+      </w:pPr>
+      <w:rPr/>
+    </w:lvl>
+    <w:lvl w:ilvl="6">
+      <w:start w:val="1"/>
+      <w:numFmt w:val="decimal"/>
+      <w:lvlText w:val="%7."/>
+      <w:lvlJc w:val="left"/>
+      <w:pPr>
+        <w:tabs>
+          <w:tab w:val="num" w:pos="0"/>
+        </w:tabs>
+        <w:ind w:left="5040" w:hanging="480"/>
+      </w:pPr>
+      <w:rPr/>
+    </w:lvl>
+    <w:lvl w:ilvl="7">
+      <w:start w:val="1"/>
+      <w:numFmt w:val="decimal"/>
+      <w:lvlText w:val="%8."/>
+      <w:lvlJc w:val="left"/>
+      <w:pPr>
+        <w:tabs>
+          <w:tab w:val="num" w:pos="0"/>
+        </w:tabs>
+        <w:ind w:left="5760" w:hanging="480"/>
+      </w:pPr>
+      <w:rPr/>
+    </w:lvl>
+    <w:lvl w:ilvl="8">
+      <w:start w:val="1"/>
+      <w:numFmt w:val="decimal"/>
+      <w:lvlText w:val="%9."/>
+      <w:lvlJc w:val="left"/>
+      <w:pPr>
+        <w:tabs>
+          <w:tab w:val="num" w:pos="0"/>
+        </w:tabs>
+        <w:ind w:left="6480" w:hanging="480"/>
+      </w:pPr>
+      <w:rPr/>
+    </w:lvl>
+  </w:abstractNum>
   <w:abstractNum w:abstractNumId="7">
     <w:lvl w:ilvl="0">
       <w:numFmt w:val="bullet"/>
@@ -10001,6 +10501,142 @@
     </w:lvl>
   </w:abstractNum>
   <w:abstractNum w:abstractNumId="8">
+    <w:lvl w:ilvl="0">
+      <w:numFmt w:val="bullet"/>
+      <w:lvlText w:val=""/>
+      <w:lvlJc w:val="left"/>
+      <w:pPr>
+        <w:tabs>
+          <w:tab w:val="num" w:pos="0"/>
+        </w:tabs>
+        <w:ind w:left="720" w:hanging="480"/>
+      </w:pPr>
+      <w:rPr>
+        <w:rFonts w:ascii="Symbol" w:hAnsi="Symbol" w:cs="Symbol" w:hint="default"/>
+      </w:rPr>
+    </w:lvl>
+    <w:lvl w:ilvl="1">
+      <w:start w:val="0"/>
+      <w:numFmt w:val="bullet"/>
+      <w:lvlText w:val=""/>
+      <w:lvlJc w:val="left"/>
+      <w:pPr>
+        <w:tabs>
+          <w:tab w:val="num" w:pos="0"/>
+        </w:tabs>
+        <w:ind w:left="1440" w:hanging="480"/>
+      </w:pPr>
+      <w:rPr>
+        <w:rFonts w:ascii="Symbol" w:hAnsi="Symbol" w:cs="Symbol" w:hint="default"/>
+      </w:rPr>
+    </w:lvl>
+    <w:lvl w:ilvl="2">
+      <w:start w:val="0"/>
+      <w:numFmt w:val="bullet"/>
+      <w:lvlText w:val=""/>
+      <w:lvlJc w:val="left"/>
+      <w:pPr>
+        <w:tabs>
+          <w:tab w:val="num" w:pos="0"/>
+        </w:tabs>
+        <w:ind w:left="2160" w:hanging="480"/>
+      </w:pPr>
+      <w:rPr>
+        <w:rFonts w:ascii="Symbol" w:hAnsi="Symbol" w:cs="Symbol" w:hint="default"/>
+      </w:rPr>
+    </w:lvl>
+    <w:lvl w:ilvl="3">
+      <w:start w:val="0"/>
+      <w:numFmt w:val="bullet"/>
+      <w:lvlText w:val=""/>
+      <w:lvlJc w:val="left"/>
+      <w:pPr>
+        <w:tabs>
+          <w:tab w:val="num" w:pos="0"/>
+        </w:tabs>
+        <w:ind w:left="2880" w:hanging="480"/>
+      </w:pPr>
+      <w:rPr>
+        <w:rFonts w:ascii="Symbol" w:hAnsi="Symbol" w:cs="Symbol" w:hint="default"/>
+      </w:rPr>
+    </w:lvl>
+    <w:lvl w:ilvl="4">
+      <w:start w:val="0"/>
+      <w:numFmt w:val="bullet"/>
+      <w:lvlText w:val=""/>
+      <w:lvlJc w:val="left"/>
+      <w:pPr>
+        <w:tabs>
+          <w:tab w:val="num" w:pos="0"/>
+        </w:tabs>
+        <w:ind w:left="3600" w:hanging="480"/>
+      </w:pPr>
+      <w:rPr>
+        <w:rFonts w:ascii="Symbol" w:hAnsi="Symbol" w:cs="Symbol" w:hint="default"/>
+      </w:rPr>
+    </w:lvl>
+    <w:lvl w:ilvl="5">
+      <w:start w:val="0"/>
+      <w:numFmt w:val="bullet"/>
+      <w:lvlText w:val=""/>
+      <w:lvlJc w:val="left"/>
+      <w:pPr>
+        <w:tabs>
+          <w:tab w:val="num" w:pos="0"/>
+        </w:tabs>
+        <w:ind w:left="4320" w:hanging="480"/>
+      </w:pPr>
+      <w:rPr>
+        <w:rFonts w:ascii="Symbol" w:hAnsi="Symbol" w:cs="Symbol" w:hint="default"/>
+      </w:rPr>
+    </w:lvl>
+    <w:lvl w:ilvl="6">
+      <w:start w:val="0"/>
+      <w:numFmt w:val="bullet"/>
+      <w:lvlText w:val=""/>
+      <w:lvlJc w:val="left"/>
+      <w:pPr>
+        <w:tabs>
+          <w:tab w:val="num" w:pos="0"/>
+        </w:tabs>
+        <w:ind w:left="5040" w:hanging="480"/>
+      </w:pPr>
+      <w:rPr>
+        <w:rFonts w:ascii="Symbol" w:hAnsi="Symbol" w:cs="Symbol" w:hint="default"/>
+      </w:rPr>
+    </w:lvl>
+    <w:lvl w:ilvl="7">
+      <w:start w:val="0"/>
+      <w:numFmt w:val="bullet"/>
+      <w:lvlText w:val=""/>
+      <w:lvlJc w:val="left"/>
+      <w:pPr>
+        <w:tabs>
+          <w:tab w:val="num" w:pos="0"/>
+        </w:tabs>
+        <w:ind w:left="5760" w:hanging="480"/>
+      </w:pPr>
+      <w:rPr>
+        <w:rFonts w:ascii="Symbol" w:hAnsi="Symbol" w:cs="Symbol" w:hint="default"/>
+      </w:rPr>
+    </w:lvl>
+    <w:lvl w:ilvl="8">
+      <w:start w:val="0"/>
+      <w:numFmt w:val="bullet"/>
+      <w:lvlText w:val=""/>
+      <w:lvlJc w:val="left"/>
+      <w:pPr>
+        <w:tabs>
+          <w:tab w:val="num" w:pos="0"/>
+        </w:tabs>
+        <w:ind w:left="6480" w:hanging="480"/>
+      </w:pPr>
+      <w:rPr>
+        <w:rFonts w:ascii="Symbol" w:hAnsi="Symbol" w:cs="Symbol" w:hint="default"/>
+      </w:rPr>
+    </w:lvl>
+  </w:abstractNum>
+  <w:abstractNum w:abstractNumId="9">
     <w:lvl w:ilvl="0">
       <w:start w:val="1"/>
       <w:numFmt w:val="none"/>
@@ -10144,7 +10780,7 @@
     <w:abstractNumId w:val="8"/>
   </w:num>
   <w:num w:numId="9">
-    <w:abstractNumId w:val="1"/>
+    <w:abstractNumId w:val="9"/>
   </w:num>
   <w:num w:numId="10">
     <w:abstractNumId w:val="1"/>
@@ -10180,10 +10816,7 @@
     <w:abstractNumId w:val="1"/>
   </w:num>
   <w:num w:numId="21">
-    <w:abstractNumId w:val="5"/>
-    <w:lvlOverride w:ilvl="0">
-      <w:startOverride w:val="1"/>
-    </w:lvlOverride>
+    <w:abstractNumId w:val="1"/>
   </w:num>
   <w:num w:numId="22">
     <w:abstractNumId w:val="1"/>
@@ -10192,7 +10825,10 @@
     <w:abstractNumId w:val="1"/>
   </w:num>
   <w:num w:numId="24">
-    <w:abstractNumId w:val="1"/>
+    <w:abstractNumId w:val="6"/>
+    <w:lvlOverride w:ilvl="0">
+      <w:startOverride w:val="1"/>
+    </w:lvlOverride>
   </w:num>
   <w:num w:numId="25">
     <w:abstractNumId w:val="1"/>
@@ -10219,6 +10855,15 @@
     <w:abstractNumId w:val="1"/>
   </w:num>
   <w:num w:numId="33">
+    <w:abstractNumId w:val="1"/>
+  </w:num>
+  <w:num w:numId="34">
+    <w:abstractNumId w:val="1"/>
+  </w:num>
+  <w:num w:numId="35">
+    <w:abstractNumId w:val="1"/>
+  </w:num>
+  <w:num w:numId="36">
     <w:abstractNumId w:val="1"/>
   </w:num>
 </w:numbering>

</xml_diff>